<commit_message>
Issue #1/#5: enriquecer el corpus y consistencia de citas
Documentos (más planes y detalle):
- comparativa_planes.csv: nuevo plan Starter + ~27 características comparadas.
- planes_y_precios.xlsx: hojas Planes, Add-ons, Descuentos y Detalle por plan.
- base_conocimiento.md: sección de planes, seguridad, reportes, móvil, más detalle.
- integraciones_api.json: más endpoints, integraciones, webhooks y códigos de error.
- faq_soporte.html: muchas más FAQ (reembolsos, descuentos, datos, idiomas...).
- onboarding_producto.pptx, terminos_de_uso.docx, politica_privacidad.pdf ampliados.

Generación:
- _remap_citations: renumera los [n] del texto para que coincidan exactamente con
  la lista de fuentes citadas y deduplica por archivo (reemplaza a _cited_sources).

Co-Authored-By: Claude Opus 4.8 (1M context) <noreply@anthropic.com>
</commit_message>
<xml_diff>
--- a/data/documents/legal/terminos_de_uso.docx
+++ b/data/documents/legal/terminos_de_uso.docx
@@ -25,7 +25,7 @@
     </w:p>
     <w:p>
       <w:r>
-        <w:t>El usuario es responsable de mantener la confidencialidad de sus credenciales y de toda actividad realizada bajo su cuenta.</w:t>
+        <w:t>El usuario es responsable de mantener la confidencialidad de sus credenciales y de toda actividad realizada bajo su cuenta. Debe notificar de inmediato cualquier uso no autorizado.</w:t>
       </w:r>
     </w:p>
     <w:p>
@@ -38,7 +38,7 @@
     </w:p>
     <w:p>
       <w:r>
-        <w:t>Está prohibido usar la plataforma para actividades ilícitas, distribuir malware o intentar vulnerar la seguridad del servicio.</w:t>
+        <w:t>Está prohibido usar la plataforma para actividades ilícitas, distribuir malware, enviar spam o intentar vulnerar la seguridad del servicio.</w:t>
       </w:r>
     </w:p>
     <w:p>
@@ -51,7 +51,7 @@
     </w:p>
     <w:p>
       <w:r>
-        <w:t>Las suscripciones se renuevan automáticamente. El usuario puede cancelar en cualquier momento desde Configuración → Facturación; el servicio sigue activo hasta el fin del período pagado.</w:t>
+        <w:t>Las suscripciones se renuevan automáticamente según el ciclo elegido (mensual o anual). El usuario puede cancelar en cualquier momento desde Configuración → Facturación; el servicio sigue activo hasta el fin del período pagado.</w:t>
       </w:r>
     </w:p>
     <w:p>
@@ -59,12 +59,12 @@
         <w:pStyle w:val="Heading2"/>
       </w:pPr>
       <w:r>
-        <w:t>4. Disponibilidad del servicio</w:t>
+        <w:t>4. Reembolsos</w:t>
       </w:r>
     </w:p>
     <w:p>
       <w:r>
-        <w:t>TechNova ofrece niveles de disponibilidad (SLA) según el plan contratado. Consulta el documento Planes y Precios para más detalle.</w:t>
+        <w:t>Se ofrece reembolso completo dentro de los 14 días de la primera contratación de un plan de pago. Pasado ese plazo no se reembolsan períodos ya facturados.</w:t>
       </w:r>
     </w:p>
     <w:p>
@@ -72,12 +72,77 @@
         <w:pStyle w:val="Heading2"/>
       </w:pPr>
       <w:r>
-        <w:t>5. Terminación</w:t>
+        <w:t>5. Disponibilidad del servicio (SLA)</w:t>
+      </w:r>
+    </w:p>
+    <w:p>
+      <w:r>
+        <w:t>TechNova ofrece niveles de disponibilidad según el plan contratado (de 99.0% a 99.95%). Si no se cumple el SLA del plan Enterprise, el cliente puede recibir créditos de servicio. Consulta el documento Planes y Precios para más detalle.</w:t>
+      </w:r>
+    </w:p>
+    <w:p>
+      <w:pPr>
+        <w:pStyle w:val="Heading2"/>
+      </w:pPr>
+      <w:r>
+        <w:t>6. Propiedad intelectual</w:t>
+      </w:r>
+    </w:p>
+    <w:p>
+      <w:r>
+        <w:t>El contenido cargado por el usuario es de su propiedad. TechNova conserva los derechos sobre la plataforma, su marca y su software.</w:t>
+      </w:r>
+    </w:p>
+    <w:p>
+      <w:pPr>
+        <w:pStyle w:val="Heading2"/>
+      </w:pPr>
+      <w:r>
+        <w:t>7. Limitación de responsabilidad</w:t>
+      </w:r>
+    </w:p>
+    <w:p>
+      <w:r>
+        <w:t>TechNova no será responsable por daños indirectos o lucro cesante derivados del uso o la imposibilidad de uso del servicio.</w:t>
+      </w:r>
+    </w:p>
+    <w:p>
+      <w:pPr>
+        <w:pStyle w:val="Heading2"/>
+      </w:pPr>
+      <w:r>
+        <w:t>8. Terminación</w:t>
       </w:r>
     </w:p>
     <w:p>
       <w:r>
         <w:t>TechNova puede suspender cuentas que incumplan estos términos. Tras la cancelación, los datos se conservan 30 días antes de su eliminación definitiva.</w:t>
+      </w:r>
+    </w:p>
+    <w:p>
+      <w:pPr>
+        <w:pStyle w:val="Heading2"/>
+      </w:pPr>
+      <w:r>
+        <w:t>9. Cambios en los términos</w:t>
+      </w:r>
+    </w:p>
+    <w:p>
+      <w:r>
+        <w:t>TechNova puede actualizar estos términos notificando con al menos 30 días de anticipación. El uso continuado implica la aceptación de los cambios.</w:t>
+      </w:r>
+    </w:p>
+    <w:p>
+      <w:pPr>
+        <w:pStyle w:val="Heading2"/>
+      </w:pPr>
+      <w:r>
+        <w:t>10. Ley aplicable</w:t>
+      </w:r>
+    </w:p>
+    <w:p>
+      <w:r>
+        <w:t>Estos términos se rigen por la legislación vigente en la jurisdicción de TechNova, sin perjuicio de los derechos del consumidor.</w:t>
       </w:r>
     </w:p>
     <w:sectPr>

</xml_diff>